<commit_message>
Sync 29/09: cerrar disyuntivas y formalizar el análisis
Sync con Francisco, Nahuel y Paloma. Se resolvió toda la agenda:
- Primer cobro de cualquier tipo pasa el Viaje a vendido; nueva
  reversión vendido → reservado (EST-Viaje T10); pago parcial se
  resuelve dividiendo la cuota (CU-11 A6).
- CU-07 cierra la Oportunidad como ganada.
- Revertir una cancelación repone la comisión y reabre solo las
  alertas que cerró (Alerta.cerrada_por_cancelacion).
- CU-01 reordenado (cliente → consulta), 5 pasos.
- Proceso diario a las 00:00; nuevo tipo de Alerta `viaje`;
  recontacto sin duplicar, al responsable del cliente.
- salida 7 días verificado; forma_pago sin cambios; mora descartada.
- Auditoría en todas las entidades; RNF con valores del equipo.
Se formalizaron 31 CU, 13 entidades, clases, ER, EST, ACT, SEC,
Requisitos, DEC-0002 y DEC-0010. PNG y DOCX de Requisitos regenerados.

Co-Authored-By: Claude Opus 5.5 <noreply@anthropic.com>
</commit_message>
<xml_diff>
--- a/07-Entregables/Requisitos/Rumbo — Requisitos.docx
+++ b/07-Entregables/Requisitos/Rumbo — Requisitos.docx
@@ -4116,13 +4116,25 @@
         <w:rPr>
           <w:rStyle w:val="VerbatimChar"/>
         </w:rPr>
+        <w:t xml:space="preserve">perdida</w:t>
+      </w:r>
+      <w:r>
+        <w:t xml:space="preserve">, exigiendo un motivo de una lista fija: precio · fechas/disponibilidad · desistió · compró en otra agencia · sin respuesta · otro (con texto libre), o como</w:t>
+      </w:r>
+      <w:r>
+        <w:t xml:space="preserve"> </w:t>
+      </w:r>
+      <w:r>
+        <w:rPr>
+          <w:rStyle w:val="VerbatimChar"/>
+        </w:rPr>
         <w:t xml:space="preserve">ganada</w:t>
       </w:r>
       <w:r>
         <w:t xml:space="preserve"> </w:t>
       </w:r>
       <w:r>
-        <w:t xml:space="preserve">—con o sin Cotización formal previa— o como</w:t>
+        <w:t xml:space="preserve">cuando la venta se cierra sin Cotización formal. Cuando hay una cotización aceptada, la Oportunidad pasa a</w:t>
       </w:r>
       <w:r>
         <w:t xml:space="preserve"> </w:t>
@@ -4131,10 +4143,13 @@
         <w:rPr>
           <w:rStyle w:val="VerbatimChar"/>
         </w:rPr>
-        <w:t xml:space="preserve">perdida</w:t>
-      </w:r>
-      <w:r>
-        <w:t xml:space="preserve">, exigiendo en este último caso un motivo de una lista fija: precio · fechas/disponibilidad · desistió · compró en otra agencia · sin respuesta · otro (con texto libre). El motivo queda en el historial para el embudo y los reportes.</w:t>
+        <w:t xml:space="preserve">ganada</w:t>
+      </w:r>
+      <w:r>
+        <w:t xml:space="preserve"> </w:t>
+      </w:r>
+      <w:r>
+        <w:t xml:space="preserve">al confirmarse la reserva (RF-032). El motivo queda en el historial para el embudo y los reportes.</w:t>
       </w:r>
     </w:p>
     <w:p>
@@ -5578,7 +5593,7 @@
         <w:t xml:space="preserve"> </w:t>
       </w:r>
       <w:r>
-        <w:t xml:space="preserve">el sistema evalúa periódicamente el historial de cada Cliente y detecta a los candidatos a recontacto: los que llevan aproximadamente seis meses sin una nueva compra o viaje —umbral configurable— y no tienen marcado el opt-out. El criterio aplica a todos los clientes, identificando especialmente a los recurrentes (dos o más Viajes con la agencia).</w:t>
+        <w:t xml:space="preserve">el sistema evalúa todos los días, en el proceso automático de las 00:00, el historial de cada Cliente y detecta a los candidatos a recontacto: los que llevan aproximadamente seis meses sin una nueva compra o viaje —umbral configurable— y no tienen marcado el opt-out. El criterio aplica a todos los clientes, identificando especialmente a los recurrentes (dos o más Viajes con la agencia).</w:t>
       </w:r>
     </w:p>
     <w:p>
@@ -5723,7 +5738,7 @@
         <w:t xml:space="preserve"> </w:t>
       </w:r>
       <w:r>
-        <w:t xml:space="preserve">o lo lista en un panel de clientes a recontactar, y muestra el contexto del Cliente (último viaje, preferencias, historial). El sistema sugiere; el contacto lo hace una persona, sin envío automático.</w:t>
+        <w:t xml:space="preserve">asignada al responsable del Cliente —o a un administrador si no tiene un responsable activo— y muestra el contexto del cliente (último viaje, preferencias, historial). No genera una segunda alerta mientras el cliente tenga otra de recontacto sin resolver. El sistema sugiere; el contacto lo hace una persona, sin envío automático.</w:t>
       </w:r>
     </w:p>
     <w:p>
@@ -6297,7 +6312,7 @@
         <w:t xml:space="preserve"> </w:t>
       </w:r>
       <w:r>
-        <w:t xml:space="preserve">desde una Oportunidad</w:t>
+        <w:t xml:space="preserve">desde una Oportunidad con su Cotización aceptada, el sistema crea el Viaje en estado</w:t>
       </w:r>
       <w:r>
         <w:t xml:space="preserve"> </w:t>
@@ -6306,25 +6321,25 @@
         <w:rPr>
           <w:rStyle w:val="VerbatimChar"/>
         </w:rPr>
+        <w:t xml:space="preserve">reservado</w:t>
+      </w:r>
+      <w:r>
+        <w:t xml:space="preserve"> </w:t>
+      </w:r>
+      <w:r>
+        <w:t xml:space="preserve">con destino del catálogo, fechas de salida y regreso, categoría y responsable, vinculado al Cliente y a la Oportunidad de origen, y cierra esa oportunidad como</w:t>
+      </w:r>
+      <w:r>
+        <w:t xml:space="preserve"> </w:t>
+      </w:r>
+      <w:r>
+        <w:rPr>
+          <w:rStyle w:val="VerbatimChar"/>
+        </w:rPr>
         <w:t xml:space="preserve">ganada</w:t>
       </w:r>
       <w:r>
-        <w:t xml:space="preserve">, el sistema crea el Viaje en estado</w:t>
-      </w:r>
-      <w:r>
-        <w:t xml:space="preserve"> </w:t>
-      </w:r>
-      <w:r>
-        <w:rPr>
-          <w:rStyle w:val="VerbatimChar"/>
-        </w:rPr>
-        <w:t xml:space="preserve">reservado</w:t>
-      </w:r>
-      <w:r>
-        <w:t xml:space="preserve"> </w:t>
-      </w:r>
-      <w:r>
-        <w:t xml:space="preserve">con destino del catálogo, fechas de salida y regreso, categoría y responsable, vinculado al Cliente y a la Oportunidad de origen, que queda cerrada como ganada. La reserva también puede confirmarse sin Cotización formal previa.</w:t>
+        <w:t xml:space="preserve">. La reserva también puede confirmarse sin Cotización formal previa, desde una oportunidad ya cerrada como ganada.</w:t>
       </w:r>
     </w:p>
     <w:p>
@@ -6874,7 +6889,7 @@
         <w:t xml:space="preserve"> </w:t>
       </w:r>
       <w:r>
-        <w:t xml:space="preserve">al confirmar la reserva, el sistema encadena el registro del control económico y la definición del plan de cuotas con su seña, y ofrece armar el itinerario de hoteles. El Viaje no queda cerrado sin su economía y su plan cargados.</w:t>
+        <w:t xml:space="preserve">al confirmar la reserva, el sistema encadena el registro del control económico y la definición del plan de cuotas —con o sin seña— y ofrece armar el itinerario de hoteles. El Viaje no queda cerrado sin su economía y su plan cargados.</w:t>
       </w:r>
     </w:p>
     <w:p>
@@ -7164,7 +7179,7 @@
         <w:t xml:space="preserve"> </w:t>
       </w:r>
       <w:r>
-        <w:t xml:space="preserve">al cobrarse la seña y de</w:t>
+        <w:t xml:space="preserve">con el primer cobro registrado, sea la seña, una cuota o el pago único, y de</w:t>
       </w:r>
       <w:r>
         <w:t xml:space="preserve"> </w:t>
@@ -7194,7 +7209,7 @@
         <w:t xml:space="preserve"> </w:t>
       </w:r>
       <w:r>
-        <w:t xml:space="preserve">al saldarse el total. Son transiciones automáticas disparadas por el cobro, no acciones manuales.</w:t>
+        <w:t xml:space="preserve">al saldarse el total; si un mismo cobro salda el total, aplica las dos transiciones en orden. Son transiciones automáticas disparadas por el cobro, no acciones manuales.</w:t>
       </w:r>
     </w:p>
     <w:p>
@@ -7324,7 +7339,7 @@
         <w:t xml:space="preserve"> </w:t>
       </w:r>
       <w:r>
-        <w:t xml:space="preserve">el sistema sugiere el paso a</w:t>
+        <w:t xml:space="preserve">el día de salida y el de regreso, el sistema genera una Alerta de tipo</w:t>
       </w:r>
       <w:r>
         <w:t xml:space="preserve"> </w:t>
@@ -7333,13 +7348,28 @@
         <w:rPr>
           <w:rStyle w:val="VerbatimChar"/>
         </w:rPr>
+        <w:t xml:space="preserve">viaje</w:t>
+      </w:r>
+      <w:r>
+        <w:t xml:space="preserve"> </w:t>
+      </w:r>
+      <w:r>
+        <w:t xml:space="preserve">para el responsable, que sugiere el paso a</w:t>
+      </w:r>
+      <w:r>
+        <w:t xml:space="preserve"> </w:t>
+      </w:r>
+      <w:r>
+        <w:rPr>
+          <w:rStyle w:val="VerbatimChar"/>
+        </w:rPr>
         <w:t xml:space="preserve">en curso</w:t>
       </w:r>
       <w:r>
         <w:t xml:space="preserve"> </w:t>
       </w:r>
       <w:r>
-        <w:t xml:space="preserve">y a</w:t>
+        <w:t xml:space="preserve">o a</w:t>
       </w:r>
       <w:r>
         <w:t xml:space="preserve"> </w:t>
@@ -7351,10 +7381,7 @@
         <w:t xml:space="preserve">finalizado</w:t>
       </w:r>
       <w:r>
-        <w:t xml:space="preserve"> </w:t>
-      </w:r>
-      <w:r>
-        <w:t xml:space="preserve">según las fechas de salida y regreso, pero exige que el empleado lo confirme y nunca lo fuerza: si el regreso se demora, el viaje se mantiene</w:t>
+        <w:t xml:space="preserve">; exige que el empleado lo confirme y nunca lo fuerza: si el regreso se demora, el viaje se mantiene</w:t>
       </w:r>
       <w:r>
         <w:t xml:space="preserve"> </w:t>
@@ -9462,7 +9489,7 @@
         <w:t xml:space="preserve"> </w:t>
       </w:r>
       <w:r>
-        <w:t xml:space="preserve">según su fecha y sus Alertas se reabren.</w:t>
+        <w:t xml:space="preserve">según su fecha, se reabren solo las Alertas que había cerrado la cancelación y, si se había dejado constancia de que la comisión no se realizaba, la comisión vuelve a quedar proyectada.</w:t>
       </w:r>
     </w:p>
     <w:p>
@@ -11907,7 +11934,7 @@
         <w:t xml:space="preserve"> </w:t>
       </w:r>
       <w:r>
-        <w:t xml:space="preserve">según su fecha, su Alerta se reabre y, si el Viaje había pasado a</w:t>
+        <w:t xml:space="preserve">según su fecha y su Alerta se reabre. Si el Viaje había pasado a</w:t>
       </w:r>
       <w:r>
         <w:t xml:space="preserve"> </w:t>
@@ -11932,6 +11959,18 @@
           <w:rStyle w:val="VerbatimChar"/>
         </w:rPr>
         <w:t xml:space="preserve">vendido</w:t>
+      </w:r>
+      <w:r>
+        <w:t xml:space="preserve">; si era el único cobro del viaje, vuelve a</w:t>
+      </w:r>
+      <w:r>
+        <w:t xml:space="preserve"> </w:t>
+      </w:r>
+      <w:r>
+        <w:rPr>
+          <w:rStyle w:val="VerbatimChar"/>
+        </w:rPr>
+        <w:t xml:space="preserve">reservado</w:t>
       </w:r>
       <w:r>
         <w:t xml:space="preserve">.</w:t>
@@ -12194,7 +12233,7 @@
         <w:t xml:space="preserve"> </w:t>
       </w:r>
       <w:r>
-        <w:t xml:space="preserve">el Pago es indivisible: se cobra completo, sin cobros parciales. Un esquema de cobro distinto se modela cambiando el plan de cuotas, no partiendo un pago.</w:t>
+        <w:t xml:space="preserve">el Pago es indivisible: se cobra completo, sin cobros parciales. Si el cliente paga solo una parte, antes de cobrar se divide la cuota en dos dentro del plan de cuotas, respetando que la suma siga igual al precio de venta. La diferencia que produzca el tipo de cambio queda registrada en el monto cobrado.</w:t>
       </w:r>
     </w:p>
     <w:p>
@@ -12414,6 +12453,18 @@
         <w:t xml:space="preserve">manual</w:t>
       </w:r>
       <w:r>
+        <w:t xml:space="preserve">,</w:t>
+      </w:r>
+      <w:r>
+        <w:t xml:space="preserve"> </w:t>
+      </w:r>
+      <w:r>
+        <w:rPr>
+          <w:rStyle w:val="VerbatimChar"/>
+        </w:rPr>
+        <w:t xml:space="preserve">recontacto</w:t>
+      </w:r>
+      <w:r>
         <w:t xml:space="preserve"> </w:t>
       </w:r>
       <w:r>
@@ -12426,7 +12477,7 @@
         <w:rPr>
           <w:rStyle w:val="VerbatimChar"/>
         </w:rPr>
-        <w:t xml:space="preserve">recontacto</w:t>
+        <w:t xml:space="preserve">viaje</w:t>
       </w:r>
       <w:r>
         <w:t xml:space="preserve">, y ofrece la acción correspondiente a cada uno.</w:t>
@@ -23332,7 +23383,7 @@
         <w:t xml:space="preserve"> </w:t>
       </w:r>
       <w:r>
-        <w:t xml:space="preserve">el sistema registra quién creó y quién modificó por última vez cada registro, junto con la fecha, para poder identificar quién realizó cada acción dentro del CRM. Un log de acciones completo queda para una fase posterior.</w:t>
+        <w:t xml:space="preserve">el sistema registra quién creó y quién modificó por última vez cada registro de todas las entidades, operativas y de catálogo, junto con la fecha, para poder identificar quién realizó cada acción dentro del CRM. Un log de acciones completo queda para una fase posterior.</w:t>
       </w:r>
     </w:p>
     <w:p>
@@ -24206,7 +24257,7 @@
         <w:t xml:space="preserve"> </w:t>
       </w:r>
       <w:r>
-        <w:t xml:space="preserve">la información se respalda periódicamente y el respaldo permite restaurar el sistema a un estado consistente anterior.</w:t>
+        <w:t xml:space="preserve">la base de datos se respalda de forma automática una vez por día, después del proceso automático de las 00:00. Cada respaldo se conserva 30 días, con una copia guardada fuera del servidor, y permite restaurar el sistema a un estado consistente anterior.</w:t>
       </w:r>
     </w:p>
     <w:p>
@@ -24250,7 +24301,7 @@
         <w:t xml:space="preserve"> </w:t>
       </w:r>
       <w:r>
-        <w:t xml:space="preserve">existe un respaldo verificable y probado mediante una restauración completa.</w:t>
+        <w:t xml:space="preserve">existe un respaldo de cada uno de los últimos 30 días, con su copia externa, y se prueba mediante una restauración completa.</w:t>
       </w:r>
     </w:p>
     <w:bookmarkEnd w:id="228"/>
@@ -24292,7 +24343,7 @@
         <w:t xml:space="preserve"> </w:t>
       </w:r>
       <w:r>
-        <w:t xml:space="preserve">las pantallas de uso frecuente —la agenda de alertas, la búsqueda de clientes y hoteles, y la ficha del viaje— responden con fluidez y sin esperas perceptibles en condiciones normales de uso.</w:t>
+        <w:t xml:space="preserve">las pantallas de uso frecuente —la agenda de alertas, la búsqueda de clientes y hoteles, y la ficha del viaje— responden en 2 segundos o menos en el 95 % de los casos, con hasta 10 usuarios trabajando en simultáneo.</w:t>
       </w:r>
     </w:p>
     <w:p>
@@ -24336,7 +24387,7 @@
         <w:t xml:space="preserve"> </w:t>
       </w:r>
       <w:r>
-        <w:t xml:space="preserve">las consultas frecuentes se resuelven en tiempos que no interrumpen el ritmo de la atención.</w:t>
+        <w:t xml:space="preserve">una prueba de carga con 10 usuarios simultáneos mide el percentil 95 de las pantallas frecuentes en 2 segundos o menos.</w:t>
       </w:r>
     </w:p>
     <w:bookmarkEnd w:id="230"/>
@@ -24368,7 +24419,7 @@
         <w:t xml:space="preserve"> </w:t>
       </w:r>
       <w:r>
-        <w:t xml:space="preserve">el rendimiento de las consultas se sostiene a medida que se acumulan clientes, viajes y pagos de sucesivas temporadas. Los listados extensos se entregan paginados y los reportes se acotan al período solicitado.</w:t>
+        <w:t xml:space="preserve">el rendimiento de las consultas se sostiene a medida que se acumulan clientes, viajes y pagos de sucesivas temporadas, y cumple la meta de RNF-09 con al menos 5.000 clientes y su historial cargados. Los listados extensos se entregan paginados y los reportes se acotan al período solicitado.</w:t>
       </w:r>
     </w:p>
     <w:p>
@@ -24412,7 +24463,7 @@
         <w:t xml:space="preserve"> </w:t>
       </w:r>
       <w:r>
-        <w:t xml:space="preserve">los tiempos de respuesta se mantienen estables al crecer el volumen de datos históricos.</w:t>
+        <w:t xml:space="preserve">con una base de prueba de 5.000 clientes y su historial, los tiempos de respuesta siguen dentro de la meta de RNF-09.</w:t>
       </w:r>
     </w:p>
     <w:bookmarkEnd w:id="231"/>
@@ -24588,13 +24639,13 @@
         <w:t xml:space="preserve">Disponibilidad</w:t>
       </w:r>
     </w:p>
-    <w:bookmarkStart w:id="236" w:name="X2339074a1f82e9abc9c37f1a76f2df5bb0124fc"/>
+    <w:bookmarkStart w:id="236" w:name="rnf-13-disponibilidad-permanente"/>
     <w:p>
       <w:pPr>
         <w:pStyle w:val="Heading4"/>
       </w:pPr>
       <w:r>
-        <w:t xml:space="preserve">RNF-13 — Disponibilidad en el horario de operación</w:t>
+        <w:t xml:space="preserve">RNF-13 — Disponibilidad permanente</w:t>
       </w:r>
     </w:p>
     <w:p>
@@ -24616,7 +24667,7 @@
         <w:t xml:space="preserve"> </w:t>
       </w:r>
       <w:r>
-        <w:t xml:space="preserve">el sistema está disponible durante el horario de atención de la agencia. Las tareas de mantenimiento se realizan fuera de ese horario.</w:t>
+        <w:t xml:space="preserve">el sistema está disponible las 24 horas, todos los días. Las tareas de mantenimiento planificado se programan en la franja de menor uso y se avisan a los usuarios con anticipación.</w:t>
       </w:r>
     </w:p>
     <w:p>
@@ -24638,7 +24689,7 @@
         <w:t xml:space="preserve"> </w:t>
       </w:r>
       <w:r>
-        <w:t xml:space="preserve">durante la atención el sistema es la única fuente de la información del cliente y del estado de su viaje. Una caída en horario comercial deja al asesor sin poder cotizar, cobrar ni responder.</w:t>
+        <w:t xml:space="preserve">durante la atención el sistema es la única fuente de la información del cliente y del estado de su viaje. Además, las consultas llegan por Instagram y WhatsApp a cualquier hora y el proceso automático corre a medianoche. Una caída en horario comercial deja al asesor sin poder cotizar, cobrar ni responder.</w:t>
       </w:r>
     </w:p>
     <w:p>
@@ -24660,7 +24711,7 @@
         <w:t xml:space="preserve"> </w:t>
       </w:r>
       <w:r>
-        <w:t xml:space="preserve">las interrupciones planificadas quedan fuera del horario de atención.</w:t>
+        <w:t xml:space="preserve">el sistema responde a cualquier hora, y toda interrupción planificada se anuncia antes y se hace en la franja de menor uso.</w:t>
       </w:r>
     </w:p>
     <w:bookmarkEnd w:id="236"/>
@@ -24702,7 +24753,7 @@
         <w:t xml:space="preserve"> </w:t>
       </w:r>
       <w:r>
-        <w:t xml:space="preserve">el sistema ofrece una aplicación web para la gestión completa y una aplicación mobile para el acceso a la agenda, las alertas y los clientes. Ambas comparten la misma información en tiempo real y funcionan sobre navegadores y dispositivos de uso corriente.</w:t>
+        <w:t xml:space="preserve">el sistema ofrece una aplicación web para la gestión completa y una aplicación mobile para el acceso a la agenda, las alertas y los clientes. Ambas comparten la misma información en tiempo real. La web soporta las dos últimas versiones de Chrome, Edge y Firefox (Safari, sin garantía); la mobile, Android 10 o superior e iOS 15 o superior.</w:t>
       </w:r>
     </w:p>
     <w:p>
@@ -24746,7 +24797,7 @@
         <w:t xml:space="preserve"> </w:t>
       </w:r>
       <w:r>
-        <w:t xml:space="preserve">agenda, alertas y clientes son accesibles y operables desde ambas plataformas, con la misma información.</w:t>
+        <w:t xml:space="preserve">agenda, alertas y clientes son accesibles y operables desde ambas plataformas, con la misma información, en los navegadores y versiones de sistema indicados.</w:t>
       </w:r>
     </w:p>
     <w:bookmarkEnd w:id="238"/>

</xml_diff>